<commit_message>
Fix template double tag issues
</commit_message>
<xml_diff>
--- a/LASTWINNERLETTER.docx
+++ b/LASTWINNERLETTER.docx
@@ -1018,6 +1018,8 @@
         </w:rPr>
         <w:t>{{winnerName}}</w:t>
       </w:r>
+      <w:bookmarkStart w:id="0" w:name="_GoBack"/>
+      <w:bookmarkEnd w:id="0"/>
       <w:r>
         <w:rPr>
           <w:rFonts w:hint="default" w:ascii="Times New Roman" w:hAnsi="Times New Roman"/>
@@ -1029,8 +1031,6 @@
         </w:rPr>
         <w:t xml:space="preserve"> </w:t>
       </w:r>
-      <w:bookmarkStart w:id="0" w:name="_GoBack"/>
-      <w:bookmarkEnd w:id="0"/>
       <w:r>
         <w:rPr>
           <w:rFonts w:ascii="Power Geez Unicode3" w:hAnsi="Power Geez Unicode3" w:cs="Ebrima"/>
@@ -2912,7 +2912,7 @@
     <w:lsdException w:uiPriority="99" w:name="Normal Indent"/>
     <w:lsdException w:uiPriority="99" w:name="footnote text"/>
     <w:lsdException w:uiPriority="99" w:name="annotation text"/>
-    <w:lsdException w:uiPriority="99" w:semiHidden="0" w:name="header"/>
+    <w:lsdException w:qFormat="1" w:uiPriority="99" w:semiHidden="0" w:name="header"/>
     <w:lsdException w:qFormat="1" w:uiPriority="99" w:semiHidden="0" w:name="footer"/>
     <w:lsdException w:uiPriority="99" w:name="index heading"/>
     <w:lsdException w:qFormat="1" w:uiPriority="35" w:name="caption"/>
@@ -2984,7 +2984,7 @@
     <w:lsdException w:uiPriority="99" w:name="HTML Sample"/>
     <w:lsdException w:uiPriority="99" w:name="HTML Typewriter"/>
     <w:lsdException w:uiPriority="99" w:name="HTML Variable"/>
-    <w:lsdException w:uiPriority="99" w:name="Normal Table"/>
+    <w:lsdException w:qFormat="1" w:uiPriority="99" w:name="Normal Table"/>
     <w:lsdException w:uiPriority="99" w:name="annotation subject"/>
     <w:lsdException w:uiPriority="99" w:name="Table Simple 1"/>
     <w:lsdException w:uiPriority="99" w:name="Table Simple 2"/>
@@ -3160,6 +3160,7 @@
     <w:name w:val="Normal Table"/>
     <w:semiHidden/>
     <w:unhideWhenUsed/>
+    <w:qFormat/>
     <w:uiPriority w:val="99"/>
     <w:tblPr>
       <w:tblCellMar>
@@ -3211,6 +3212,7 @@
     <w:basedOn w:val="1"/>
     <w:link w:val="11"/>
     <w:unhideWhenUsed/>
+    <w:qFormat/>
     <w:uiPriority w:val="99"/>
     <w:pPr>
       <w:widowControl/>

</xml_diff>